<commit_message>
Prepare Alavette Form V1.0 release candidate
</commit_message>
<xml_diff>
--- a/config_library/masters/official/builtin/official_gbt_letter.docx
+++ b/config_library/masters/official/builtin/official_gbt_letter.docx
@@ -4,43 +4,16 @@
   <w:body>
     <w:p>
       <w:pPr>
-        <w:ind w:firstLine="0"/>
-      </w:pPr>
-      <w:r>
-        <w:rPr>
-          <w:rFonts w:ascii="黑体" w:hAnsi="黑体" w:eastAsia="黑体"/>
-          <w:b/>
-          <w:color w:val="000000"/>
-          <w:sz w:val="32"/>
-        </w:rPr>
-        <w:t>{{@text:official_security_level}}</w:t>
-      </w:r>
-    </w:p>
-    <w:p>
-      <w:pPr>
-        <w:ind w:firstLine="0"/>
-      </w:pPr>
-      <w:r>
-        <w:rPr>
-          <w:rFonts w:ascii="黑体" w:hAnsi="黑体" w:eastAsia="黑体"/>
-          <w:b/>
-          <w:color w:val="000000"/>
-          <w:sz w:val="32"/>
-        </w:rPr>
-        <w:t>{{@text:official_urgency}}</w:t>
-      </w:r>
-    </w:p>
-    <w:p>
-      <w:pPr>
-        <w:spacing w:after="80"/>
+        <w:spacing w:after="0" w:lineRule="atLeast" w:line="864"/>
+        <w:ind w:left="-397" w:right="-397"/>
         <w:jc w:val="center"/>
         <w:pBdr>
-          <w:bottom w:val="double" w:sz="18" w:space="2" w:color="C00000"/>
+          <w:bottom w:val="thickThinSmallGap" w:sz="18" w:space="0" w:color="C00000"/>
         </w:pBdr>
       </w:pPr>
       <w:r>
         <w:rPr>
-          <w:rFonts w:ascii="FZXiaoBiaoSong-B05S" w:hAnsi="FZXiaoBiaoSong-B05S" w:eastAsia="方正小标宋简体"/>
+          <w:rFonts w:ascii="Noto Serif SC" w:hAnsi="Noto Serif SC" w:eastAsia="Noto Serif SC"/>
           <w:b w:val="0"/>
           <w:color w:val="C00000"/>
           <w:sz w:val="72"/>
@@ -48,23 +21,100 @@
         <w:t>{{@text:official_organization}}</w:t>
       </w:r>
     </w:p>
+    <w:tbl>
+      <w:tblPr>
+        <w:tblW w:type="dxa" w:w="8844"/>
+        <w:jc w:val="center"/>
+        <w:tblLayout w:type="fixed"/>
+        <w:tblLook w:firstColumn="1" w:firstRow="1" w:lastColumn="0" w:lastRow="0" w:noHBand="0" w:noVBand="1" w:val="04A0"/>
+        <w:tblBorders>
+          <w:top w:val="nil" w:sz="4" w:space="0" w:color="FFFFFF"/>
+          <w:left w:val="nil" w:sz="4" w:space="0" w:color="FFFFFF"/>
+          <w:bottom w:val="nil" w:sz="4" w:space="0" w:color="FFFFFF"/>
+          <w:right w:val="nil" w:sz="4" w:space="0" w:color="FFFFFF"/>
+          <w:insideH w:val="nil" w:sz="4" w:space="0" w:color="FFFFFF"/>
+          <w:insideV w:val="nil" w:sz="4" w:space="0" w:color="FFFFFF"/>
+        </w:tblBorders>
+      </w:tblPr>
+      <w:tblGrid>
+        <w:gridCol w:w="4422"/>
+        <w:gridCol w:w="4422"/>
+      </w:tblGrid>
+      <w:tr>
+        <w:tc>
+          <w:tcPr>
+            <w:tcW w:type="dxa" w:w="4422"/>
+            <w:vAlign w:val="top"/>
+            <w:tcMar>
+              <w:top w:w="0" w:type="dxa"/>
+              <w:bottom w:w="0" w:type="dxa"/>
+              <w:start w:w="0" w:type="dxa"/>
+              <w:end w:w="0" w:type="dxa"/>
+            </w:tcMar>
+          </w:tcPr>
+          <w:p>
+            <w:pPr>
+              <w:spacing w:before="80" w:after="0" w:lineRule="exact" w:line="560"/>
+              <w:ind w:firstLine="0"/>
+            </w:pPr>
+            <w:r>
+              <w:rPr>
+                <w:rFonts w:ascii="simhei" w:hAnsi="simhei" w:eastAsia="simhei"/>
+                <w:b w:val="0"/>
+                <w:color w:val="000000"/>
+                <w:sz w:val="32"/>
+              </w:rPr>
+              <w:t>{{@text:official_security_level}}</w:t>
+            </w:r>
+          </w:p>
+          <w:p>
+            <w:pPr>
+              <w:spacing w:before="0" w:after="0" w:lineRule="exact" w:line="560"/>
+              <w:ind w:firstLine="0"/>
+            </w:pPr>
+            <w:r>
+              <w:rPr>
+                <w:rFonts w:ascii="simhei" w:hAnsi="simhei" w:eastAsia="simhei"/>
+                <w:b w:val="0"/>
+                <w:color w:val="000000"/>
+                <w:sz w:val="32"/>
+              </w:rPr>
+              <w:t>{{@text:official_urgency}}</w:t>
+            </w:r>
+          </w:p>
+        </w:tc>
+        <w:tc>
+          <w:tcPr>
+            <w:tcW w:type="dxa" w:w="4422"/>
+            <w:vAlign w:val="top"/>
+            <w:tcMar>
+              <w:top w:w="0" w:type="dxa"/>
+              <w:bottom w:w="0" w:type="dxa"/>
+              <w:start w:w="0" w:type="dxa"/>
+              <w:end w:w="0" w:type="dxa"/>
+            </w:tcMar>
+          </w:tcPr>
+          <w:p>
+            <w:pPr>
+              <w:spacing w:before="80" w:after="0" w:lineRule="exact" w:line="560"/>
+              <w:ind w:firstLine="0"/>
+              <w:jc w:val="right"/>
+            </w:pPr>
+            <w:r>
+              <w:t>{{@text:official_document_no}}</w:t>
+            </w:r>
+          </w:p>
+        </w:tc>
+      </w:tr>
+    </w:tbl>
     <w:p>
       <w:pPr>
-        <w:spacing w:before="120" w:after="400"/>
-        <w:jc w:val="center"/>
-      </w:pPr>
-      <w:r>
-        <w:t>{{@text:official_document_no}}</w:t>
-      </w:r>
-    </w:p>
-    <w:p>
-      <w:pPr>
-        <w:spacing w:before="0" w:after="360" w:lineRule="exact" w:line="640"/>
+        <w:spacing w:before="560" w:after="360" w:lineRule="exact" w:line="640"/>
         <w:jc w:val="center"/>
       </w:pPr>
       <w:r>
         <w:rPr>
-          <w:rFonts w:ascii="FZXiaoBiaoSong-B05S" w:hAnsi="FZXiaoBiaoSong-B05S" w:eastAsia="方正小标宋简体"/>
+          <w:rFonts w:ascii="Noto Serif SC" w:hAnsi="Noto Serif SC" w:eastAsia="Noto Serif SC"/>
           <w:b w:val="0"/>
           <w:color w:val="000000"/>
           <w:sz w:val="44"/>
@@ -104,6 +154,7 @@
     <w:p>
       <w:pPr>
         <w:spacing w:after="0"/>
+        <w:ind w:right="624"/>
         <w:jc w:val="right"/>
       </w:pPr>
       <w:r>
@@ -112,33 +163,71 @@
     </w:p>
     <w:p>
       <w:pPr>
+        <w:ind w:right="624"/>
         <w:jc w:val="right"/>
       </w:pPr>
       <w:r>
         <w:t>{{@text:official_issue_date}}</w:t>
       </w:r>
     </w:p>
-    <w:p>
-      <w:pPr>
-        <w:spacing w:before="280"/>
-        <w:ind w:firstLine="0"/>
-      </w:pPr>
-      <w:r>
-        <w:rPr>
-          <w:rFonts w:ascii="仿宋_GB2312" w:hAnsi="仿宋_GB2312" w:eastAsia="仿宋_GB2312"/>
-          <w:b w:val="0"/>
-          <w:color w:val="000000"/>
-          <w:sz w:val="28"/>
-        </w:rPr>
-        <w:t>抄送：{{@text:official_copy_scope}}</w:t>
-      </w:r>
-    </w:p>
+    <w:tbl>
+      <w:tblPr>
+        <w:tblW w:type="dxa" w:w="9638"/>
+        <w:jc w:val="center"/>
+        <w:tblLayout w:type="fixed"/>
+        <w:tblLook w:firstColumn="1" w:firstRow="1" w:lastColumn="0" w:lastRow="0" w:noHBand="0" w:noVBand="1" w:val="04A0"/>
+        <w:tblBorders>
+          <w:top w:val="nil" w:sz="4" w:space="0" w:color="FFFFFF"/>
+          <w:left w:val="nil" w:sz="4" w:space="0" w:color="FFFFFF"/>
+          <w:bottom w:val="nil" w:sz="4" w:space="0" w:color="FFFFFF"/>
+          <w:right w:val="nil" w:sz="4" w:space="0" w:color="FFFFFF"/>
+          <w:insideH w:val="nil" w:sz="4" w:space="0" w:color="FFFFFF"/>
+          <w:insideV w:val="nil" w:sz="4" w:space="0" w:color="FFFFFF"/>
+        </w:tblBorders>
+        <w:tblpPr w:horzAnchor="margin" w:tblpXSpec="center" w:vertAnchor="margin" w:tblpYSpec="bottom" w:leftFromText="0" w:rightFromText="0" w:topFromText="0" w:bottomFromText="0"/>
+        <w:tblOverlap w:val="never"/>
+      </w:tblPr>
+      <w:tblGrid>
+        <w:gridCol w:w="9638"/>
+      </w:tblGrid>
+      <w:tr>
+        <w:trPr>
+          <w:cantSplit/>
+        </w:trPr>
+        <w:tc>
+          <w:tcPr>
+            <w:tcW w:type="dxa" w:w="9638"/>
+            <w:tcMar>
+              <w:top w:w="0" w:type="dxa"/>
+              <w:bottom w:w="0" w:type="dxa"/>
+              <w:start w:w="320" w:type="dxa"/>
+              <w:end w:w="320" w:type="dxa"/>
+            </w:tcMar>
+          </w:tcPr>
+          <w:p>
+            <w:pPr>
+              <w:spacing w:lineRule="exact" w:line="560"/>
+              <w:ind w:firstLine="0"/>
+            </w:pPr>
+            <w:r>
+              <w:rPr>
+                <w:rFonts w:ascii="FangSong" w:hAnsi="FangSong" w:eastAsia="FangSong"/>
+                <w:b w:val="0"/>
+                <w:color w:val="000000"/>
+                <w:sz w:val="28"/>
+              </w:rPr>
+              <w:t>抄送：{{@text:official_copy_scope}}</w:t>
+            </w:r>
+          </w:p>
+        </w:tc>
+      </w:tr>
+    </w:tbl>
     <w:sectPr>
       <w:footerReference w:type="default" r:id="rId9"/>
       <w:footerReference w:type="even" r:id="rId10"/>
       <w:footerReference w:type="first" r:id="rId11"/>
       <w:pgSz w:w="11906" w:h="16838"/>
-      <w:pgMar w:top="2098" w:right="1474" w:bottom="1984" w:left="1587" w:header="850" w:footer="1134" w:gutter="0"/>
+      <w:pgMar w:top="1332" w:right="1474" w:bottom="1984" w:left="1587" w:header="850" w:footer="1134" w:gutter="0"/>
       <w:cols w:space="720"/>
       <w:titlePg/>
       <w:docGrid w:linePitch="360"/>
@@ -152,16 +241,16 @@
   <w:p>
     <w:pPr>
       <w:pStyle w:val="Footer"/>
-      <w:ind w:right="312" w:left="0"/>
+      <w:ind w:right="-397" w:left="-397"/>
       <w:jc w:val="right"/>
       <w:pBdr>
-        <w:top w:val="double" w:sz="18" w:space="2" w:color="C00000"/>
+        <w:bottom w:val="thinThickSmallGap" w:sz="18" w:space="2" w:color="C00000"/>
       </w:pBdr>
     </w:pPr>
     <w:r/>
     <w:r>
       <w:rPr>
-        <w:rFonts w:ascii="SimSun" w:hAnsi="SimSun" w:eastAsia="宋体"/>
+        <w:rFonts w:ascii="simsun" w:hAnsi="simsun" w:eastAsia="simsun"/>
         <w:b w:val="0"/>
         <w:color w:val="000000"/>
         <w:sz w:val="28"/>
@@ -170,7 +259,7 @@
     </w:r>
     <w:r>
       <w:rPr>
-        <w:rFonts w:ascii="SimSun" w:hAnsi="SimSun" w:eastAsia="宋体"/>
+        <w:rFonts w:ascii="simsun" w:hAnsi="simsun" w:eastAsia="simsun"/>
         <w:b w:val="0"/>
         <w:color w:val="000000"/>
         <w:sz w:val="28"/>
@@ -183,7 +272,7 @@
     </w:r>
     <w:r>
       <w:rPr>
-        <w:rFonts w:ascii="SimSun" w:hAnsi="SimSun" w:eastAsia="宋体"/>
+        <w:rFonts w:ascii="simsun" w:hAnsi="simsun" w:eastAsia="simsun"/>
         <w:b w:val="0"/>
         <w:color w:val="000000"/>
         <w:sz w:val="28"/>
@@ -199,16 +288,16 @@
   <w:p>
     <w:pPr>
       <w:pStyle w:val="Footer"/>
-      <w:ind w:right="0" w:left="312"/>
+      <w:ind w:right="-397" w:left="-397"/>
       <w:jc w:val="left"/>
       <w:pBdr>
-        <w:top w:val="double" w:sz="18" w:space="2" w:color="C00000"/>
+        <w:bottom w:val="thinThickSmallGap" w:sz="18" w:space="2" w:color="C00000"/>
       </w:pBdr>
     </w:pPr>
     <w:r/>
     <w:r>
       <w:rPr>
-        <w:rFonts w:ascii="SimSun" w:hAnsi="SimSun" w:eastAsia="宋体"/>
+        <w:rFonts w:ascii="simsun" w:hAnsi="simsun" w:eastAsia="simsun"/>
         <w:b w:val="0"/>
         <w:color w:val="000000"/>
         <w:sz w:val="28"/>
@@ -217,7 +306,7 @@
     </w:r>
     <w:r>
       <w:rPr>
-        <w:rFonts w:ascii="SimSun" w:hAnsi="SimSun" w:eastAsia="宋体"/>
+        <w:rFonts w:ascii="simsun" w:hAnsi="simsun" w:eastAsia="simsun"/>
         <w:b w:val="0"/>
         <w:color w:val="000000"/>
         <w:sz w:val="28"/>
@@ -230,7 +319,7 @@
     </w:r>
     <w:r>
       <w:rPr>
-        <w:rFonts w:ascii="SimSun" w:hAnsi="SimSun" w:eastAsia="宋体"/>
+        <w:rFonts w:ascii="simsun" w:hAnsi="simsun" w:eastAsia="simsun"/>
         <w:b w:val="0"/>
         <w:color w:val="000000"/>
         <w:sz w:val="28"/>
@@ -246,8 +335,9 @@
   <w:p>
     <w:pPr>
       <w:pStyle w:val="Footer"/>
+      <w:ind w:left="-397" w:right="-397"/>
       <w:pBdr>
-        <w:top w:val="double" w:sz="18" w:space="2" w:color="C00000"/>
+        <w:bottom w:val="thinThickSmallGap" w:sz="18" w:space="2" w:color="C00000"/>
       </w:pBdr>
     </w:pPr>
     <w:r/>
@@ -622,7 +712,7 @@
       <w:spacing w:lineRule="exact" w:line="560" w:before="0" w:after="0"/>
     </w:pPr>
     <w:rPr>
-      <w:rFonts w:ascii="FangSong_GB2312" w:hAnsi="FangSong_GB2312" w:eastAsia="仿宋_GB2312"/>
+      <w:rFonts w:ascii="FangSong" w:hAnsi="FangSong" w:eastAsia="FangSong" w:cs="FangSong"/>
       <w:sz w:val="32"/>
     </w:rPr>
   </w:style>
@@ -679,16 +769,17 @@
     <w:qFormat/>
     <w:rsid w:val="00FC693F"/>
     <w:pPr>
-      <w:keepNext/>
-      <w:keepLines/>
+      <w:keepNext w:val="0"/>
+      <w:keepLines w:val="0"/>
+      <w:pageBreakBefore w:val="0"/>
       <w:spacing w:before="0" w:after="0" w:lineRule="exact" w:line="560"/>
       <w:outlineLvl w:val="0"/>
     </w:pPr>
     <w:rPr>
-      <w:rFonts w:asciiTheme="majorHAnsi" w:eastAsiaTheme="majorEastAsia" w:hAnsiTheme="majorHAnsi" w:cstheme="majorBidi" w:ascii="SimHei" w:hAnsi="SimHei" w:eastAsia="黑体"/>
-      <w:b/>
+      <w:rFonts w:asciiTheme="majorHAnsi" w:eastAsiaTheme="majorEastAsia" w:hAnsiTheme="majorHAnsi" w:cstheme="majorBidi" w:ascii="simhei" w:hAnsi="simhei" w:eastAsia="simhei" w:cs="simhei"/>
+      <w:b w:val="0"/>
       <w:bCs/>
-      <w:color w:val="365F91" w:themeColor="accent1" w:themeShade="BF"/>
+      <w:color w:val="000000"/>
       <w:sz w:val="32"/>
       <w:szCs w:val="28"/>
     </w:rPr>
@@ -703,16 +794,17 @@
     <w:qFormat/>
     <w:rsid w:val="00FC693F"/>
     <w:pPr>
-      <w:keepNext/>
-      <w:keepLines/>
+      <w:keepNext w:val="0"/>
+      <w:keepLines w:val="0"/>
+      <w:pageBreakBefore w:val="0"/>
       <w:spacing w:before="0" w:after="0" w:lineRule="exact" w:line="560"/>
       <w:outlineLvl w:val="1"/>
     </w:pPr>
     <w:rPr>
-      <w:rFonts w:asciiTheme="majorHAnsi" w:eastAsiaTheme="majorEastAsia" w:hAnsiTheme="majorHAnsi" w:cstheme="majorBidi" w:ascii="SimHei" w:hAnsi="SimHei" w:eastAsia="黑体"/>
-      <w:b/>
+      <w:rFonts w:asciiTheme="majorHAnsi" w:eastAsiaTheme="majorEastAsia" w:hAnsiTheme="majorHAnsi" w:cstheme="majorBidi" w:ascii="KaiTi" w:hAnsi="KaiTi" w:eastAsia="KaiTi" w:cs="KaiTi"/>
+      <w:b w:val="0"/>
       <w:bCs/>
-      <w:color w:val="4F81BD" w:themeColor="accent1"/>
+      <w:color w:val="000000"/>
       <w:sz w:val="32"/>
       <w:szCs w:val="26"/>
     </w:rPr>
@@ -727,16 +819,18 @@
     <w:qFormat/>
     <w:rsid w:val="00FC693F"/>
     <w:pPr>
-      <w:keepNext/>
-      <w:keepLines/>
-      <w:spacing w:before="200" w:after="0"/>
+      <w:keepNext w:val="0"/>
+      <w:keepLines w:val="0"/>
+      <w:pageBreakBefore w:val="0"/>
+      <w:spacing w:before="0" w:after="0" w:lineRule="exact" w:line="560"/>
       <w:outlineLvl w:val="2"/>
     </w:pPr>
     <w:rPr>
-      <w:rFonts w:asciiTheme="majorHAnsi" w:eastAsiaTheme="majorEastAsia" w:hAnsiTheme="majorHAnsi" w:cstheme="majorBidi"/>
-      <w:b/>
+      <w:rFonts w:asciiTheme="majorHAnsi" w:eastAsiaTheme="majorEastAsia" w:hAnsiTheme="majorHAnsi" w:cstheme="majorBidi" w:ascii="FangSong" w:hAnsi="FangSong" w:eastAsia="FangSong" w:cs="FangSong"/>
+      <w:b w:val="0"/>
       <w:bCs/>
-      <w:color w:val="4F81BD" w:themeColor="accent1"/>
+      <w:color w:val="000000"/>
+      <w:sz w:val="32"/>
     </w:rPr>
   </w:style>
   <w:style w:type="paragraph" w:styleId="Heading4">
@@ -750,18 +844,20 @@
     <w:qFormat/>
     <w:rsid w:val="00FC693F"/>
     <w:pPr>
-      <w:keepNext/>
-      <w:keepLines/>
-      <w:spacing w:before="200" w:after="0"/>
+      <w:keepNext w:val="0"/>
+      <w:keepLines w:val="0"/>
+      <w:pageBreakBefore w:val="0"/>
+      <w:spacing w:before="0" w:after="0" w:lineRule="exact" w:line="560"/>
       <w:outlineLvl w:val="3"/>
     </w:pPr>
     <w:rPr>
-      <w:rFonts w:asciiTheme="majorHAnsi" w:eastAsiaTheme="majorEastAsia" w:hAnsiTheme="majorHAnsi" w:cstheme="majorBidi"/>
-      <w:b/>
+      <w:rFonts w:asciiTheme="majorHAnsi" w:eastAsiaTheme="majorEastAsia" w:hAnsiTheme="majorHAnsi" w:cstheme="majorBidi" w:ascii="FangSong" w:hAnsi="FangSong" w:eastAsia="FangSong" w:cs="FangSong"/>
+      <w:b w:val="0"/>
       <w:bCs/>
       <w:i/>
       <w:iCs/>
-      <w:color w:val="4F81BD" w:themeColor="accent1"/>
+      <w:color w:val="000000"/>
+      <w:sz w:val="32"/>
     </w:rPr>
   </w:style>
   <w:style w:type="paragraph" w:styleId="Heading5">

</xml_diff>